<commit_message>
first try at latex formula
</commit_message>
<xml_diff>
--- a/word-template.docx
+++ b/word-template.docx
@@ -66,6 +66,296 @@
       </w:r>
     </w:p>
     <w:bookmarkEnd w:id="20"/>
+    <w:bookmarkStart w:id="21" w:name="latex-formula"/>
+    <w:p>
+      <w:pPr>
+        <w:pStyle w:val="berschrift1"/>
+      </w:pPr>
+      <w:r>
+        <w:t xml:space="preserve">LaTeX formula</w:t>
+      </w:r>
+    </w:p>
+    <w:p>
+      <w:pPr>
+        <w:pStyle w:val="FirstParagraph"/>
+      </w:pPr>
+      <m:oMathPara>
+        <m:oMathParaPr>
+          <m:jc m:val="center"/>
+        </m:oMathParaPr>
+        <m:oMath>
+          <m:sSub>
+            <m:e>
+              <m:r>
+                <m:t>Y</m:t>
+              </m:r>
+            </m:e>
+            <m:sub>
+              <m:r>
+                <m:t>i</m:t>
+              </m:r>
+              <m:r>
+                <m:t>t</m:t>
+              </m:r>
+            </m:sub>
+          </m:sSub>
+          <m:r>
+            <m:rPr>
+              <m:sty m:val="p"/>
+            </m:rPr>
+            <m:t>=</m:t>
+          </m:r>
+          <m:sSub>
+            <m:e>
+              <m:r>
+                <m:t>μ</m:t>
+              </m:r>
+            </m:e>
+            <m:sub>
+              <m:r>
+                <m:t>t</m:t>
+              </m:r>
+            </m:sub>
+          </m:sSub>
+          <m:r>
+            <m:rPr>
+              <m:sty m:val="p"/>
+            </m:rPr>
+            <m:t>+</m:t>
+          </m:r>
+          <m:r>
+            <m:t>α</m:t>
+          </m:r>
+          <m:d>
+            <m:dPr>
+              <m:begChr m:val="("/>
+              <m:endChr m:val=")"/>
+              <m:sepChr m:val=""/>
+              <m:grow/>
+            </m:dPr>
+            <m:e>
+              <m:sSub>
+                <m:e>
+                  <m:r>
+                    <m:t>Y</m:t>
+                  </m:r>
+                </m:e>
+                <m:sub>
+                  <m:r>
+                    <m:t>i</m:t>
+                  </m:r>
+                  <m:r>
+                    <m:rPr>
+                      <m:sty m:val="p"/>
+                    </m:rPr>
+                    <m:t>,</m:t>
+                  </m:r>
+                  <m:r>
+                    <m:t>t</m:t>
+                  </m:r>
+                  <m:r>
+                    <m:rPr>
+                      <m:sty m:val="p"/>
+                    </m:rPr>
+                    <m:t>−</m:t>
+                  </m:r>
+                  <m:r>
+                    <m:t>1</m:t>
+                  </m:r>
+                </m:sub>
+              </m:sSub>
+              <m:r>
+                <m:rPr>
+                  <m:sty m:val="p"/>
+                </m:rPr>
+                <m:t>−</m:t>
+              </m:r>
+              <m:sSub>
+                <m:e>
+                  <m:r>
+                    <m:t>μ</m:t>
+                  </m:r>
+                </m:e>
+                <m:sub>
+                  <m:r>
+                    <m:t>t</m:t>
+                  </m:r>
+                  <m:r>
+                    <m:rPr>
+                      <m:sty m:val="p"/>
+                    </m:rPr>
+                    <m:t>−</m:t>
+                  </m:r>
+                  <m:r>
+                    <m:t>1</m:t>
+                  </m:r>
+                </m:sub>
+              </m:sSub>
+            </m:e>
+          </m:d>
+          <m:r>
+            <m:rPr>
+              <m:sty m:val="p"/>
+            </m:rPr>
+            <m:t>+</m:t>
+          </m:r>
+          <m:r>
+            <m:t>γ</m:t>
+          </m:r>
+          <m:r>
+            <m:t> </m:t>
+          </m:r>
+          <m:r>
+            <m:t>P</m:t>
+          </m:r>
+          <m:sSubSup>
+            <m:e>
+              <m:r>
+                <m:t>A</m:t>
+              </m:r>
+            </m:e>
+            <m:sub>
+              <m:r>
+                <m:t>i</m:t>
+              </m:r>
+              <m:r>
+                <m:rPr>
+                  <m:sty m:val="p"/>
+                </m:rPr>
+                <m:t>,</m:t>
+              </m:r>
+              <m:r>
+                <m:t>t</m:t>
+              </m:r>
+              <m:r>
+                <m:rPr>
+                  <m:sty m:val="p"/>
+                </m:rPr>
+                <m:t>−</m:t>
+              </m:r>
+              <m:r>
+                <m:t>1</m:t>
+              </m:r>
+            </m:sub>
+            <m:sup>
+              <m:r>
+                <m:t>W</m:t>
+              </m:r>
+            </m:sup>
+          </m:sSubSup>
+          <m:r>
+            <m:rPr>
+              <m:sty m:val="p"/>
+            </m:rPr>
+            <m:t>+</m:t>
+          </m:r>
+          <m:sSub>
+            <m:e>
+              <m:r>
+                <m:t>ε</m:t>
+              </m:r>
+            </m:e>
+            <m:sub>
+              <m:r>
+                <m:t>i</m:t>
+              </m:r>
+              <m:r>
+                <m:t>t</m:t>
+              </m:r>
+            </m:sub>
+          </m:sSub>
+          <m:r>
+            <m:rPr>
+              <m:sty m:val="p"/>
+            </m:rPr>
+            <m:t>,</m:t>
+          </m:r>
+          <m:r>
+            <m:t>  </m:t>
+          </m:r>
+          <m:r>
+            <m:t>E</m:t>
+          </m:r>
+          <m:d>
+            <m:dPr>
+              <m:begChr m:val="("/>
+              <m:endChr m:val=")"/>
+              <m:sepChr m:val=""/>
+              <m:grow/>
+            </m:dPr>
+            <m:e>
+              <m:sSub>
+                <m:e>
+                  <m:r>
+                    <m:t>ε</m:t>
+                  </m:r>
+                </m:e>
+                <m:sub>
+                  <m:r>
+                    <m:t>i</m:t>
+                  </m:r>
+                  <m:r>
+                    <m:t>t</m:t>
+                  </m:r>
+                </m:sub>
+              </m:sSub>
+              <m:r>
+                <m:rPr>
+                  <m:sty m:val="p"/>
+                </m:rPr>
+                <m:t>∣</m:t>
+              </m:r>
+              <m:sSub>
+                <m:e>
+                  <m:r>
+                    <m:t>Y</m:t>
+                  </m:r>
+                </m:e>
+                <m:sub>
+                  <m:r>
+                    <m:t>i</m:t>
+                  </m:r>
+                  <m:r>
+                    <m:rPr>
+                      <m:sty m:val="p"/>
+                    </m:rPr>
+                    <m:t>,</m:t>
+                  </m:r>
+                  <m:r>
+                    <m:t>t</m:t>
+                  </m:r>
+                  <m:r>
+                    <m:rPr>
+                      <m:sty m:val="p"/>
+                    </m:rPr>
+                    <m:t>−</m:t>
+                  </m:r>
+                  <m:r>
+                    <m:t>1</m:t>
+                  </m:r>
+                </m:sub>
+              </m:sSub>
+            </m:e>
+          </m:d>
+          <m:r>
+            <m:rPr>
+              <m:sty m:val="p"/>
+            </m:rPr>
+            <m:t>=</m:t>
+          </m:r>
+          <m:r>
+            <m:t>0</m:t>
+          </m:r>
+          <m:r>
+            <m:rPr>
+              <m:sty m:val="p"/>
+            </m:rPr>
+            <m:t>.</m:t>
+          </m:r>
+        </m:oMath>
+      </m:oMathPara>
+    </w:p>
+    <w:bookmarkEnd w:id="21"/>
     <w:sectPr>
       <w:headerReference r:id="rId9" w:type="default"/>
       <w:footerReference r:id="rId14" w:type="default"/>

</xml_diff>